<commit_message>
Reorganize diagram files and update docs
Move and standardize diagram sources into docs/Diagramas/Draw Files (rename many .drawio files to consistent names like CollaborationDiagram, SequenceDiagram, UCDiagram, UCDiagramFinal, MaquinaDeEstados, etc.), remove numerous generated PNG exports and obsolete drawio variants (UCDiagramV1/V2 and many .png previews), and add a new SequenceDiagram.drawio for VisualizarEstadoDeLagunaUC. Also update docs/SoftwareSoloUC-breve.docx and add entregaSoftware.docx. Cleans repository by keeping primary source diagrams and removing exported images.
</commit_message>
<xml_diff>
--- a/docs/SoftwareSoloUC-breve.docx
+++ b/docs/SoftwareSoloUC-breve.docx
@@ -243,12 +243,12 @@
                 <wp:extent cx="5668645" cy="12700"/>
                 <wp:effectExtent b="0" l="0" r="0" t="0"/>
                 <wp:wrapNone/>
-                <wp:docPr id="2" name="image23.png"/>
+                <wp:docPr id="2" name="image21.png"/>
                 <a:graphic>
                   <a:graphicData uri="http://schemas.openxmlformats.org/drawingml/2006/picture">
                     <pic:pic>
                       <pic:nvPicPr>
-                        <pic:cNvPr id="0" name="image23.png"/>
+                        <pic:cNvPr id="0" name="image21.png"/>
                         <pic:cNvPicPr preferRelativeResize="0"/>
                       </pic:nvPicPr>
                       <pic:blipFill>
@@ -335,12 +335,12 @@
                 <wp:extent cx="5668645" cy="12700"/>
                 <wp:effectExtent b="0" l="0" r="0" t="0"/>
                 <wp:wrapNone/>
-                <wp:docPr id="1" name="image16.png"/>
+                <wp:docPr id="1" name="image19.png"/>
                 <a:graphic>
                   <a:graphicData uri="http://schemas.openxmlformats.org/drawingml/2006/picture">
                     <pic:pic>
                       <pic:nvPicPr>
-                        <pic:cNvPr id="0" name="image16.png"/>
+                        <pic:cNvPr id="0" name="image19.png"/>
                         <pic:cNvPicPr preferRelativeResize="0"/>
                       </pic:nvPicPr>
                       <pic:blipFill>
@@ -425,12 +425,12 @@
           <wp:inline distB="114300" distT="114300" distL="114300" distR="114300">
             <wp:extent cx="4684151" cy="3279887"/>
             <wp:effectExtent b="0" l="0" r="0" t="0"/>
-            <wp:docPr id="21" name="image14.png"/>
+            <wp:docPr id="21" name="image20.png"/>
             <a:graphic>
               <a:graphicData uri="http://schemas.openxmlformats.org/drawingml/2006/picture">
                 <pic:pic>
                   <pic:nvPicPr>
-                    <pic:cNvPr id="0" name="image14.png"/>
+                    <pic:cNvPr id="0" name="image20.png"/>
                     <pic:cNvPicPr preferRelativeResize="0"/>
                   </pic:nvPicPr>
                   <pic:blipFill>
@@ -541,12 +541,12 @@
           <wp:inline distB="114300" distT="114300" distL="114300" distR="114300">
             <wp:extent cx="4462463" cy="7058025"/>
             <wp:effectExtent b="0" l="0" r="0" t="0"/>
-            <wp:docPr id="12" name="image5.png"/>
+            <wp:docPr id="11" name="image10.png"/>
             <a:graphic>
               <a:graphicData uri="http://schemas.openxmlformats.org/drawingml/2006/picture">
                 <pic:pic>
                   <pic:nvPicPr>
-                    <pic:cNvPr id="0" name="image5.png"/>
+                    <pic:cNvPr id="0" name="image10.png"/>
                     <pic:cNvPicPr preferRelativeResize="0"/>
                   </pic:nvPicPr>
                   <pic:blipFill>
@@ -644,12 +644,12 @@
           <wp:inline distB="114300" distT="114300" distL="114300" distR="114300">
             <wp:extent cx="3657600" cy="1257300"/>
             <wp:effectExtent b="0" l="0" r="0" t="0"/>
-            <wp:docPr id="11" name="image2.png"/>
+            <wp:docPr id="10" name="image5.png"/>
             <a:graphic>
               <a:graphicData uri="http://schemas.openxmlformats.org/drawingml/2006/picture">
                 <pic:pic>
                   <pic:nvPicPr>
-                    <pic:cNvPr id="0" name="image2.png"/>
+                    <pic:cNvPr id="0" name="image5.png"/>
                     <pic:cNvPicPr preferRelativeResize="0"/>
                   </pic:nvPicPr>
                   <pic:blipFill>
@@ -1878,12 +1878,12 @@
           <wp:inline distB="114300" distT="114300" distL="114300" distR="114300">
             <wp:extent cx="4614863" cy="2270659"/>
             <wp:effectExtent b="0" l="0" r="0" t="0"/>
-            <wp:docPr id="4" name="image3.png"/>
+            <wp:docPr id="4" name="image9.png"/>
             <a:graphic>
               <a:graphicData uri="http://schemas.openxmlformats.org/drawingml/2006/picture">
                 <pic:pic>
                   <pic:nvPicPr>
-                    <pic:cNvPr id="0" name="image3.png"/>
+                    <pic:cNvPr id="0" name="image9.png"/>
                     <pic:cNvPicPr preferRelativeResize="0"/>
                   </pic:nvPicPr>
                   <pic:blipFill>
@@ -1934,12 +1934,12 @@
           <wp:inline distB="114300" distT="114300" distL="114300" distR="114300">
             <wp:extent cx="3676650" cy="3157234"/>
             <wp:effectExtent b="0" l="0" r="0" t="0"/>
-            <wp:docPr id="14" name="image12.png"/>
+            <wp:docPr id="13" name="image8.png"/>
             <a:graphic>
               <a:graphicData uri="http://schemas.openxmlformats.org/drawingml/2006/picture">
                 <pic:pic>
                   <pic:nvPicPr>
-                    <pic:cNvPr id="0" name="image12.png"/>
+                    <pic:cNvPr id="0" name="image8.png"/>
                     <pic:cNvPicPr preferRelativeResize="0"/>
                   </pic:nvPicPr>
                   <pic:blipFill>
@@ -3037,12 +3037,12 @@
           <wp:inline distB="114300" distT="114300" distL="114300" distR="114300">
             <wp:extent cx="4829175" cy="3058173"/>
             <wp:effectExtent b="0" l="0" r="0" t="0"/>
-            <wp:docPr id="13" name="image7.png"/>
+            <wp:docPr id="12" name="image12.png"/>
             <a:graphic>
               <a:graphicData uri="http://schemas.openxmlformats.org/drawingml/2006/picture">
                 <pic:pic>
                   <pic:nvPicPr>
-                    <pic:cNvPr id="0" name="image7.png"/>
+                    <pic:cNvPr id="0" name="image12.png"/>
                     <pic:cNvPicPr preferRelativeResize="0"/>
                   </pic:nvPicPr>
                   <pic:blipFill>
@@ -3117,14 +3117,14 @@
         </w:rPr>
         <w:drawing>
           <wp:inline distB="114300" distT="114300" distL="114300" distR="114300">
-            <wp:extent cx="4141157" cy="3190987"/>
+            <wp:extent cx="4990238" cy="4509974"/>
             <wp:effectExtent b="0" l="0" r="0" t="0"/>
-            <wp:docPr id="8" name="image6.png"/>
+            <wp:docPr id="17" name="image17.png"/>
             <a:graphic>
               <a:graphicData uri="http://schemas.openxmlformats.org/drawingml/2006/picture">
                 <pic:pic>
                   <pic:nvPicPr>
-                    <pic:cNvPr id="0" name="image6.png"/>
+                    <pic:cNvPr id="0" name="image17.png"/>
                     <pic:cNvPicPr preferRelativeResize="0"/>
                   </pic:nvPicPr>
                   <pic:blipFill>
@@ -3137,7 +3137,7 @@
                   <pic:spPr>
                     <a:xfrm>
                       <a:off x="0" y="0"/>
-                      <a:ext cx="4141157" cy="3190987"/>
+                      <a:ext cx="4990238" cy="4509974"/>
                     </a:xfrm>
                     <a:prstGeom prst="rect"/>
                     <a:ln/>
@@ -3225,12 +3225,12 @@
           <wp:inline distB="114300" distT="114300" distL="114300" distR="114300">
             <wp:extent cx="3018289" cy="1736550"/>
             <wp:effectExtent b="0" l="0" r="0" t="0"/>
-            <wp:docPr id="3" name="image24.png"/>
+            <wp:docPr id="3" name="image11.png"/>
             <a:graphic>
               <a:graphicData uri="http://schemas.openxmlformats.org/drawingml/2006/picture">
                 <pic:pic>
                   <pic:nvPicPr>
-                    <pic:cNvPr id="0" name="image24.png"/>
+                    <pic:cNvPr id="0" name="image11.png"/>
                     <pic:cNvPicPr preferRelativeResize="0"/>
                   </pic:nvPicPr>
                   <pic:blipFill>
@@ -4443,12 +4443,12 @@
           <wp:inline distB="114300" distT="114300" distL="114300" distR="114300">
             <wp:extent cx="6332400" cy="1549400"/>
             <wp:effectExtent b="0" l="0" r="0" t="0"/>
-            <wp:docPr id="23" name="image11.png"/>
+            <wp:docPr id="23" name="image14.png"/>
             <a:graphic>
               <a:graphicData uri="http://schemas.openxmlformats.org/drawingml/2006/picture">
                 <pic:pic>
                   <pic:nvPicPr>
-                    <pic:cNvPr id="0" name="image11.png"/>
+                    <pic:cNvPr id="0" name="image14.png"/>
                     <pic:cNvPicPr preferRelativeResize="0"/>
                   </pic:nvPicPr>
                   <pic:blipFill>
@@ -4536,12 +4536,12 @@
           <wp:inline distB="114300" distT="114300" distL="114300" distR="114300">
             <wp:extent cx="5817223" cy="3857737"/>
             <wp:effectExtent b="0" l="0" r="0" t="0"/>
-            <wp:docPr id="5" name="image13.png"/>
+            <wp:docPr id="5" name="image23.png"/>
             <a:graphic>
               <a:graphicData uri="http://schemas.openxmlformats.org/drawingml/2006/picture">
                 <pic:pic>
                   <pic:nvPicPr>
-                    <pic:cNvPr id="0" name="image13.png"/>
+                    <pic:cNvPr id="0" name="image23.png"/>
                     <pic:cNvPicPr preferRelativeResize="0"/>
                   </pic:nvPicPr>
                   <pic:blipFill>
@@ -4756,12 +4756,12 @@
           <wp:inline distB="114300" distT="114300" distL="114300" distR="114300">
             <wp:extent cx="3067050" cy="1209675"/>
             <wp:effectExtent b="0" l="0" r="0" t="0"/>
-            <wp:docPr id="15" name="image10.png"/>
+            <wp:docPr id="14" name="image6.png"/>
             <a:graphic>
               <a:graphicData uri="http://schemas.openxmlformats.org/drawingml/2006/picture">
                 <pic:pic>
                   <pic:nvPicPr>
-                    <pic:cNvPr id="0" name="image10.png"/>
+                    <pic:cNvPr id="0" name="image6.png"/>
                     <pic:cNvPicPr preferRelativeResize="0"/>
                   </pic:nvPicPr>
                   <pic:blipFill>
@@ -6391,12 +6391,12 @@
           <wp:inline distB="114300" distT="114300" distL="114300" distR="114300">
             <wp:extent cx="6332400" cy="1117600"/>
             <wp:effectExtent b="0" l="0" r="0" t="0"/>
-            <wp:docPr id="19" name="image22.png"/>
+            <wp:docPr id="19" name="image7.png"/>
             <a:graphic>
               <a:graphicData uri="http://schemas.openxmlformats.org/drawingml/2006/picture">
                 <pic:pic>
                   <pic:nvPicPr>
-                    <pic:cNvPr id="0" name="image22.png"/>
+                    <pic:cNvPr id="0" name="image7.png"/>
                     <pic:cNvPicPr preferRelativeResize="0"/>
                   </pic:nvPicPr>
                   <pic:blipFill>
@@ -6469,12 +6469,12 @@
           <wp:inline distB="114300" distT="114300" distL="114300" distR="114300">
             <wp:extent cx="6332400" cy="4559300"/>
             <wp:effectExtent b="0" l="0" r="0" t="0"/>
-            <wp:docPr id="6" name="image9.png"/>
+            <wp:docPr id="6" name="image15.png"/>
             <a:graphic>
               <a:graphicData uri="http://schemas.openxmlformats.org/drawingml/2006/picture">
                 <pic:pic>
                   <pic:nvPicPr>
-                    <pic:cNvPr id="0" name="image9.png"/>
+                    <pic:cNvPr id="0" name="image15.png"/>
                     <pic:cNvPicPr preferRelativeResize="0"/>
                   </pic:nvPicPr>
                   <pic:blipFill>
@@ -6600,12 +6600,12 @@
           <wp:inline distB="114300" distT="114300" distL="114300" distR="114300">
             <wp:extent cx="3067050" cy="1209675"/>
             <wp:effectExtent b="0" l="0" r="0" t="0"/>
-            <wp:docPr id="7" name="image20.png"/>
+            <wp:docPr id="7" name="image3.png"/>
             <a:graphic>
               <a:graphicData uri="http://schemas.openxmlformats.org/drawingml/2006/picture">
                 <pic:pic>
                   <pic:nvPicPr>
-                    <pic:cNvPr id="0" name="image20.png"/>
+                    <pic:cNvPr id="0" name="image3.png"/>
                     <pic:cNvPicPr preferRelativeResize="0"/>
                   </pic:nvPicPr>
                   <pic:blipFill>
@@ -8557,12 +8557,12 @@
           <wp:inline distB="114300" distT="114300" distL="114300" distR="114300">
             <wp:extent cx="6332400" cy="2514600"/>
             <wp:effectExtent b="0" l="0" r="0" t="0"/>
-            <wp:docPr id="17" name="image8.png"/>
+            <wp:docPr id="16" name="image16.png"/>
             <a:graphic>
               <a:graphicData uri="http://schemas.openxmlformats.org/drawingml/2006/picture">
                 <pic:pic>
                   <pic:nvPicPr>
-                    <pic:cNvPr id="0" name="image8.png"/>
+                    <pic:cNvPr id="0" name="image16.png"/>
                     <pic:cNvPicPr preferRelativeResize="0"/>
                   </pic:nvPicPr>
                   <pic:blipFill>
@@ -8666,12 +8666,12 @@
           <wp:inline distB="114300" distT="114300" distL="114300" distR="114300">
             <wp:extent cx="6332400" cy="3327400"/>
             <wp:effectExtent b="0" l="0" r="0" t="0"/>
-            <wp:docPr id="20" name="image21.png"/>
+            <wp:docPr id="20" name="image24.png"/>
             <a:graphic>
               <a:graphicData uri="http://schemas.openxmlformats.org/drawingml/2006/picture">
                 <pic:pic>
                   <pic:nvPicPr>
-                    <pic:cNvPr id="0" name="image21.png"/>
+                    <pic:cNvPr id="0" name="image24.png"/>
                     <pic:cNvPicPr preferRelativeResize="0"/>
                   </pic:nvPicPr>
                   <pic:blipFill>
@@ -8766,12 +8766,12 @@
           <wp:inline distB="114300" distT="114300" distL="114300" distR="114300">
             <wp:extent cx="3019425" cy="1438275"/>
             <wp:effectExtent b="0" l="0" r="0" t="0"/>
-            <wp:docPr id="10" name="image17.png"/>
+            <wp:docPr id="9" name="image2.png"/>
             <a:graphic>
               <a:graphicData uri="http://schemas.openxmlformats.org/drawingml/2006/picture">
                 <pic:pic>
                   <pic:nvPicPr>
-                    <pic:cNvPr id="0" name="image17.png"/>
+                    <pic:cNvPr id="0" name="image2.png"/>
                     <pic:cNvPicPr preferRelativeResize="0"/>
                   </pic:nvPicPr>
                   <pic:blipFill>
@@ -9876,12 +9876,12 @@
           <wp:inline distB="114300" distT="114300" distL="114300" distR="114300">
             <wp:extent cx="6332400" cy="901700"/>
             <wp:effectExtent b="0" l="0" r="0" t="0"/>
-            <wp:docPr id="25" name="image18.png"/>
+            <wp:docPr id="25" name="image13.png"/>
             <a:graphic>
               <a:graphicData uri="http://schemas.openxmlformats.org/drawingml/2006/picture">
                 <pic:pic>
                   <pic:nvPicPr>
-                    <pic:cNvPr id="0" name="image18.png"/>
+                    <pic:cNvPr id="0" name="image13.png"/>
                     <pic:cNvPicPr preferRelativeResize="0"/>
                   </pic:nvPicPr>
                   <pic:blipFill>
@@ -9956,12 +9956,12 @@
           <wp:inline distB="114300" distT="114300" distL="114300" distR="114300">
             <wp:extent cx="6332400" cy="4559300"/>
             <wp:effectExtent b="0" l="0" r="0" t="0"/>
-            <wp:docPr id="24" name="image15.png"/>
+            <wp:docPr id="24" name="image18.png"/>
             <a:graphic>
               <a:graphicData uri="http://schemas.openxmlformats.org/drawingml/2006/picture">
                 <pic:pic>
                   <pic:nvPicPr>
-                    <pic:cNvPr id="0" name="image15.png"/>
+                    <pic:cNvPr id="0" name="image18.png"/>
                     <pic:cNvPicPr preferRelativeResize="0"/>
                   </pic:nvPicPr>
                   <pic:blipFill>
@@ -10012,12 +10012,12 @@
           <wp:inline distB="114300" distT="114300" distL="114300" distR="114300">
             <wp:extent cx="6162675" cy="4967972"/>
             <wp:effectExtent b="0" l="0" r="0" t="0"/>
-            <wp:docPr id="9" name="image19.png"/>
+            <wp:docPr id="8" name="image22.png"/>
             <a:graphic>
               <a:graphicData uri="http://schemas.openxmlformats.org/drawingml/2006/picture">
                 <pic:pic>
                   <pic:nvPicPr>
-                    <pic:cNvPr id="0" name="image19.png"/>
+                    <pic:cNvPr id="0" name="image22.png"/>
                     <pic:cNvPicPr preferRelativeResize="0"/>
                   </pic:nvPicPr>
                   <pic:blipFill>
@@ -10438,7 +10438,7 @@
           <wp:extent cx="1155065" cy="1138555"/>
           <wp:effectExtent b="0" l="0" r="0" t="0"/>
           <wp:wrapNone/>
-          <wp:docPr descr="http://jupiter.winkhosting.net/~magestas/moodle/imagenes_subidas/unillanos.png" id="16" name="image1.png"/>
+          <wp:docPr descr="http://jupiter.winkhosting.net/~magestas/moodle/imagenes_subidas/unillanos.png" id="15" name="image1.png"/>
           <a:graphic>
             <a:graphicData uri="http://schemas.openxmlformats.org/drawingml/2006/picture">
               <pic:pic>

</xml_diff>